<commit_message>
implementacion manual de marcas y ejercicio docker y .war
</commit_message>
<xml_diff>
--- a/1ERA EV/DIW (INTERFACES WEB)/MANUAL DE MARCAS - documento.docx
+++ b/1ERA EV/DIW (INTERFACES WEB)/MANUAL DE MARCAS - documento.docx
@@ -9,60 +9,21 @@
     </w:p>
     <w:p>
       <w:r>
-        <w:lastRenderedPageBreak/>
         <w:t>TABLA DE CONTENIDO</w:t>
       </w:r>
       <w:r>
         <w:br/>
       </w:r>
+      <w:bookmarkStart w:id="0" w:name="_GoBack"/>
+      <w:bookmarkEnd w:id="0"/>
     </w:p>
     <w:p>
       <w:r>
-        <w:drawing>
-          <wp:inline distT="0" distB="0" distL="0" distR="0" wp14:anchorId="13D021F3" wp14:editId="32B314FC">
-            <wp:extent cx="5400040" cy="5805170"/>
-            <wp:effectExtent l="0" t="0" r="0" b="5080"/>
-            <wp:docPr id="1" name="Imagen 1"/>
-            <wp:cNvGraphicFramePr>
-              <a:graphicFrameLocks xmlns:a="http://schemas.openxmlformats.org/drawingml/2006/main" noChangeAspect="1"/>
-            </wp:cNvGraphicFramePr>
-            <a:graphic xmlns:a="http://schemas.openxmlformats.org/drawingml/2006/main">
-              <a:graphicData uri="http://schemas.openxmlformats.org/drawingml/2006/picture">
-                <pic:pic xmlns:pic="http://schemas.openxmlformats.org/drawingml/2006/picture">
-                  <pic:nvPicPr>
-                    <pic:cNvPr id="1" name=""/>
-                    <pic:cNvPicPr/>
-                  </pic:nvPicPr>
-                  <pic:blipFill>
-                    <a:blip r:embed="rId4"/>
-                    <a:stretch>
-                      <a:fillRect/>
-                    </a:stretch>
-                  </pic:blipFill>
-                  <pic:spPr>
-                    <a:xfrm>
-                      <a:off x="0" y="0"/>
-                      <a:ext cx="5400040" cy="5805170"/>
-                    </a:xfrm>
-                    <a:prstGeom prst="rect">
-                      <a:avLst/>
-                    </a:prstGeom>
-                  </pic:spPr>
-                </pic:pic>
-              </a:graphicData>
-            </a:graphic>
-          </wp:inline>
-        </w:drawing>
+        <w:br w:type="page"/>
       </w:r>
     </w:p>
     <w:p>
       <w:r>
-        <w:br w:type="page"/>
-      </w:r>
-    </w:p>
-    <w:p>
-      <w:r>
-        <w:lastRenderedPageBreak/>
         <w:t>INTRODUCCIÓN</w:t>
       </w:r>
     </w:p>
@@ -109,11 +70,9 @@
       <w:r>
         <w:t xml:space="preserve">En conclusión, este manual de marcas, servirá como base/herramienta a utilizar para tener un ligero criterio de las características de la empresa. En ningún momento se pretende restringir la creatividad; sino que se pretende demarcar unas pautas mínimas (variables, regidas por la empresa), de manera que de manera resultante se llegue a la conclusión de un producto 100% terminado, pulido y </w:t>
       </w:r>
-      <w:bookmarkStart w:id="0" w:name="_GoBack"/>
       <w:r>
         <w:t>efectuado según se rigen las normas.</w:t>
       </w:r>
-      <w:bookmarkEnd w:id="0"/>
       <w:r>
         <w:br w:type="page"/>
       </w:r>

</xml_diff>